<commit_message>
fix: exercise instructions needed fixing
</commit_message>
<xml_diff>
--- a/exercises/lab_03_01/Lab Instructions.docx
+++ b/exercises/lab_03_01/Lab Instructions.docx
@@ -705,7 +705,7 @@
           <w:szCs w:val="28"/>
           <w:lang w:val="en-US"/>
         </w:rPr>
-        <w:t>Provided Files (starter data — see package below)</w:t>
+        <w:t>Provided Files (starter data — lab3_starter_data.zip in this lab's folder)</w:t>
       </w:r>
     </w:p>
     <w:p xmlns:wp14="http://schemas.microsoft.com/office/word/2010/wordml" wp14:paraId="53BEDDB6" wp14:textId="19199BAE">
@@ -2169,270 +2169,6 @@
         <w:bidi w:val="0"/>
         <w:spacing w:before="0" w:beforeAutospacing="off" w:after="0" w:afterAutospacing="off"/>
       </w:pPr>
-    </w:p>
-    <w:p xmlns:wp14="http://schemas.microsoft.com/office/word/2010/wordml" wp14:paraId="33C3729C" wp14:textId="5C976E0E">
-      <w:pPr>
-        <w:bidi w:val="0"/>
-        <w:spacing w:before="240" w:beforeAutospacing="off" w:after="240" w:afterAutospacing="off"/>
-      </w:pPr>
-      <w:r>
-        <w:rPr>
-          <w:rFonts w:ascii="Aptos" w:hAnsi="Aptos" w:eastAsia="Aptos" w:cs="Aptos"/>
-          <w:noProof w:val="0"/>
-          <w:sz w:val="24"/>
-          <w:szCs w:val="24"/>
-          <w:lang w:val="en-US"/>
-        </w:rPr>
-        <w:t>Now let me build the starter data package.</w:t>
-      </w:r>
-    </w:p>
-    <w:p xmlns:wp14="http://schemas.microsoft.com/office/word/2010/wordml" wp14:paraId="6CF13930" wp14:textId="6046135F">
-      <w:pPr>
-        <w:bidi w:val="0"/>
-        <w:spacing w:before="0" w:beforeAutospacing="off" w:after="0" w:afterAutospacing="off"/>
-      </w:pPr>
-      <w:r>
-        <w:rPr>
-          <w:rFonts w:ascii="Aptos" w:hAnsi="Aptos" w:eastAsia="Aptos" w:cs="Aptos"/>
-          <w:noProof w:val="0"/>
-          <w:sz w:val="24"/>
-          <w:szCs w:val="24"/>
-          <w:lang w:val="en-US"/>
-        </w:rPr>
-        <w:t>Architected tenant complaint dataset with varied urgency signals</w:t>
-      </w:r>
-    </w:p>
-    <w:p xmlns:wp14="http://schemas.microsoft.com/office/word/2010/wordml" wp14:paraId="00C13AC2" wp14:textId="155C0821">
-      <w:pPr>
-        <w:bidi w:val="0"/>
-        <w:spacing w:before="0" w:beforeAutospacing="off" w:after="0" w:afterAutospacing="off"/>
-      </w:pPr>
-      <w:r>
-        <w:rPr>
-          <w:rFonts w:ascii="Aptos" w:hAnsi="Aptos" w:eastAsia="Aptos" w:cs="Aptos"/>
-          <w:noProof w:val="0"/>
-          <w:sz w:val="24"/>
-          <w:szCs w:val="24"/>
-          <w:lang w:val="en-US"/>
-        </w:rPr>
-        <w:t>Architected tenant complaint dataset with varied urgency signals</w:t>
-      </w:r>
-    </w:p>
-    <w:p xmlns:wp14="http://schemas.microsoft.com/office/word/2010/wordml" wp14:paraId="7BA8A359" wp14:textId="6DC5FB6B">
-      <w:pPr>
-        <w:bidi w:val="0"/>
-        <w:spacing w:before="240" w:beforeAutospacing="off" w:after="240" w:afterAutospacing="off"/>
-      </w:pPr>
-      <w:r>
-        <w:rPr>
-          <w:rFonts w:ascii="Aptos" w:hAnsi="Aptos" w:eastAsia="Aptos" w:cs="Aptos"/>
-          <w:noProof w:val="0"/>
-          <w:sz w:val="24"/>
-          <w:szCs w:val="24"/>
-          <w:lang w:val="en-US"/>
-        </w:rPr>
-        <w:t>The lab instructions are above in chat, and the starter data package is ready for download. Quick summary of what's in it:</w:t>
-      </w:r>
-    </w:p>
-    <w:p xmlns:wp14="http://schemas.microsoft.com/office/word/2010/wordml" wp14:paraId="433D7765" wp14:textId="13CDEC5C">
-      <w:pPr>
-        <w:pStyle w:val="ListParagraph"/>
-        <w:numPr>
-          <w:ilvl w:val="0"/>
-          <w:numId w:val="7"/>
-        </w:numPr>
-        <w:bidi w:val="0"/>
-        <w:spacing w:before="0" w:beforeAutospacing="off" w:after="0" w:afterAutospacing="off"/>
-        <w:rPr>
-          <w:rFonts w:ascii="Aptos" w:hAnsi="Aptos" w:eastAsia="Aptos" w:cs="Aptos"/>
-          <w:noProof w:val="0"/>
-          <w:sz w:val="24"/>
-          <w:szCs w:val="24"/>
-          <w:lang w:val="en-US"/>
-        </w:rPr>
-      </w:pPr>
-      <w:r>
-        <w:rPr>
-          <w:rFonts w:ascii="Aptos" w:hAnsi="Aptos" w:eastAsia="Aptos" w:cs="Aptos"/>
-          <w:b w:val="1"/>
-          <w:bCs w:val="1"/>
-          <w:noProof w:val="0"/>
-          <w:sz w:val="24"/>
-          <w:szCs w:val="24"/>
-          <w:lang w:val="en-US"/>
-        </w:rPr>
-        <w:t>stage1_rename/</w:t>
-      </w:r>
-      <w:r>
-        <w:rPr>
-          <w:rFonts w:ascii="Aptos" w:hAnsi="Aptos" w:eastAsia="Aptos" w:cs="Aptos"/>
-          <w:noProof w:val="0"/>
-          <w:sz w:val="24"/>
-          <w:szCs w:val="24"/>
-          <w:lang w:val="en-US"/>
-        </w:rPr>
-        <w:t xml:space="preserve"> — </w:t>
-      </w:r>
-      <w:r>
-        <w:rPr>
-          <w:rFonts w:ascii="Consolas" w:hAnsi="Consolas" w:eastAsia="Consolas" w:cs="Consolas"/>
-          <w:noProof w:val="0"/>
-          <w:sz w:val="24"/>
-          <w:szCs w:val="24"/>
-          <w:lang w:val="en-US"/>
-        </w:rPr>
-        <w:t>mapping.csv</w:t>
-      </w:r>
-      <w:r>
-        <w:rPr>
-          <w:rFonts w:ascii="Aptos" w:hAnsi="Aptos" w:eastAsia="Aptos" w:cs="Aptos"/>
-          <w:noProof w:val="0"/>
-          <w:sz w:val="24"/>
-          <w:szCs w:val="24"/>
-          <w:lang w:val="en-US"/>
-        </w:rPr>
-        <w:t xml:space="preserve"> (12 entries) + </w:t>
-      </w:r>
-      <w:r>
-        <w:rPr>
-          <w:rFonts w:ascii="Consolas" w:hAnsi="Consolas" w:eastAsia="Consolas" w:cs="Consolas"/>
-          <w:noProof w:val="0"/>
-          <w:sz w:val="24"/>
-          <w:szCs w:val="24"/>
-          <w:lang w:val="en-US"/>
-        </w:rPr>
-        <w:t>incoming_files/</w:t>
-      </w:r>
-      <w:r>
-        <w:rPr>
-          <w:rFonts w:ascii="Aptos" w:hAnsi="Aptos" w:eastAsia="Aptos" w:cs="Aptos"/>
-          <w:noProof w:val="0"/>
-          <w:sz w:val="24"/>
-          <w:szCs w:val="24"/>
-          <w:lang w:val="en-US"/>
-        </w:rPr>
-        <w:t xml:space="preserve"> (12 matching placeholder photos/docs + 1 intentionally unmatched file)</w:t>
-      </w:r>
-    </w:p>
-    <w:p xmlns:wp14="http://schemas.microsoft.com/office/word/2010/wordml" wp14:paraId="062ABEFA" wp14:textId="79F24C44">
-      <w:pPr>
-        <w:pStyle w:val="ListParagraph"/>
-        <w:numPr>
-          <w:ilvl w:val="0"/>
-          <w:numId w:val="7"/>
-        </w:numPr>
-        <w:bidi w:val="0"/>
-        <w:spacing w:before="0" w:beforeAutospacing="off" w:after="0" w:afterAutospacing="off"/>
-        <w:rPr>
-          <w:rFonts w:ascii="Aptos" w:hAnsi="Aptos" w:eastAsia="Aptos" w:cs="Aptos"/>
-          <w:noProof w:val="0"/>
-          <w:sz w:val="24"/>
-          <w:szCs w:val="24"/>
-          <w:lang w:val="en-US"/>
-        </w:rPr>
-      </w:pPr>
-      <w:r>
-        <w:rPr>
-          <w:rFonts w:ascii="Aptos" w:hAnsi="Aptos" w:eastAsia="Aptos" w:cs="Aptos"/>
-          <w:b w:val="1"/>
-          <w:bCs w:val="1"/>
-          <w:noProof w:val="0"/>
-          <w:sz w:val="24"/>
-          <w:szCs w:val="24"/>
-          <w:lang w:val="en-US"/>
-        </w:rPr>
-        <w:t>stage2_clean/</w:t>
-      </w:r>
-      <w:r>
-        <w:rPr>
-          <w:rFonts w:ascii="Aptos" w:hAnsi="Aptos" w:eastAsia="Aptos" w:cs="Aptos"/>
-          <w:noProof w:val="0"/>
-          <w:sz w:val="24"/>
-          <w:szCs w:val="24"/>
-          <w:lang w:val="en-US"/>
-        </w:rPr>
-        <w:t xml:space="preserve"> — </w:t>
-      </w:r>
-      <w:r>
-        <w:rPr>
-          <w:rFonts w:ascii="Consolas" w:hAnsi="Consolas" w:eastAsia="Consolas" w:cs="Consolas"/>
-          <w:noProof w:val="0"/>
-          <w:sz w:val="24"/>
-          <w:szCs w:val="24"/>
-          <w:lang w:val="en-US"/>
-        </w:rPr>
-        <w:t>maintenance_requests_raw.csv</w:t>
-      </w:r>
-      <w:r>
-        <w:rPr>
-          <w:rFonts w:ascii="Aptos" w:hAnsi="Aptos" w:eastAsia="Aptos" w:cs="Aptos"/>
-          <w:noProof w:val="0"/>
-          <w:sz w:val="24"/>
-          <w:szCs w:val="24"/>
-          <w:lang w:val="en-US"/>
-        </w:rPr>
-        <w:t xml:space="preserve"> (20 rows, 3 date formats, missing priority values, inconsistent cost formatting, one exact duplicate)</w:t>
-      </w:r>
-    </w:p>
-    <w:p xmlns:wp14="http://schemas.microsoft.com/office/word/2010/wordml" wp14:paraId="5E2E3501" wp14:textId="349D8803">
-      <w:pPr>
-        <w:pStyle w:val="ListParagraph"/>
-        <w:numPr>
-          <w:ilvl w:val="0"/>
-          <w:numId w:val="7"/>
-        </w:numPr>
-        <w:bidi w:val="0"/>
-        <w:spacing w:before="0" w:beforeAutospacing="off" w:after="0" w:afterAutospacing="off"/>
-        <w:rPr>
-          <w:rFonts w:ascii="Aptos" w:hAnsi="Aptos" w:eastAsia="Aptos" w:cs="Aptos"/>
-          <w:noProof w:val="0"/>
-          <w:sz w:val="24"/>
-          <w:szCs w:val="24"/>
-          <w:lang w:val="en-US"/>
-        </w:rPr>
-      </w:pPr>
-      <w:r>
-        <w:rPr>
-          <w:rFonts w:ascii="Aptos" w:hAnsi="Aptos" w:eastAsia="Aptos" w:cs="Aptos"/>
-          <w:b w:val="1"/>
-          <w:bCs w:val="1"/>
-          <w:noProof w:val="0"/>
-          <w:sz w:val="24"/>
-          <w:szCs w:val="24"/>
-          <w:lang w:val="en-US"/>
-        </w:rPr>
-        <w:t>stage3_parse/</w:t>
-      </w:r>
-      <w:r>
-        <w:rPr>
-          <w:rFonts w:ascii="Aptos" w:hAnsi="Aptos" w:eastAsia="Aptos" w:cs="Aptos"/>
-          <w:noProof w:val="0"/>
-          <w:sz w:val="24"/>
-          <w:szCs w:val="24"/>
-          <w:lang w:val="en-US"/>
-        </w:rPr>
-        <w:t xml:space="preserve"> — </w:t>
-      </w:r>
-      <w:r>
-        <w:rPr>
-          <w:rFonts w:ascii="Consolas" w:hAnsi="Consolas" w:eastAsia="Consolas" w:cs="Consolas"/>
-          <w:noProof w:val="0"/>
-          <w:sz w:val="24"/>
-          <w:szCs w:val="24"/>
-          <w:lang w:val="en-US"/>
-        </w:rPr>
-        <w:t>tenant_complaints.txt</w:t>
-      </w:r>
-      <w:r>
-        <w:rPr>
-          <w:rFonts w:ascii="Aptos" w:hAnsi="Aptos" w:eastAsia="Aptos" w:cs="Aptos"/>
-          <w:noProof w:val="0"/>
-          <w:sz w:val="24"/>
-          <w:szCs w:val="24"/>
-          <w:lang w:val="en-US"/>
-        </w:rPr>
-        <w:t xml:space="preserve"> (20 entries, three different urgency phrasings — "Priority: High," "URGENT!!," "fairly urgent" — plus one with no urgency signal at all)</w:t>
-      </w:r>
     </w:p>
     <w:p xmlns:wp14="http://schemas.microsoft.com/office/word/2010/wordml" wp14:paraId="2C078E63" wp14:textId="6CA1F294"/>
     <w:sectPr>

</xml_diff>